<commit_message>
Enhance document generation and PDF export functionality
- Updated `fill_from_excel.py` to include an option for exporting documents to PDF.
- Introduced `convert_docx_to_pdf` function in `fill_template.py` for converting Word documents to PDF format.
- Modified `generate_variants.py` to utilize the new PDF export feature.
- Enhanced `README.md` with instructions for using the PDF export option.
- Updated `requirements.txt` to include `docx2pdf` for PDF conversion support.
- Revised comments and configuration details in `config_variants.json` for clarity.
</commit_message>
<xml_diff>
--- a/Шаблон Район нагрузок электрической сети.docx
+++ b/Шаблон Район нагрузок электрической сети.docx
@@ -369,15 +369,15 @@
           <w:rFonts w:ascii="Times New Roman" w:hAnsi="Times New Roman" w:cs="Times New Roman"/>
           <w:sz w:val="24"/>
         </w:rPr>
-        <w:t>отка и вы</w:t>
-      </w:r>
-      <w:bookmarkStart w:id="4" w:name="OCRUncertain016"/>
-      <w:r>
-        <w:rPr>
-          <w:rFonts w:ascii="Times New Roman" w:hAnsi="Times New Roman" w:cs="Times New Roman"/>
-          <w:sz w:val="24"/>
-        </w:rPr>
-        <w:t>б</w:t>
+        <w:t>отка схе</w:t>
+      </w:r>
+      <w:bookmarkStart w:id="4" w:name="OCRUncertain017"/>
+      <w:r>
+        <w:rPr>
+          <w:rFonts w:ascii="Times New Roman" w:hAnsi="Times New Roman" w:cs="Times New Roman"/>
+          <w:sz w:val="24"/>
+        </w:rPr>
+        <w:t>м</w:t>
       </w:r>
       <w:bookmarkEnd w:id="4"/>
       <w:r>
@@ -385,15 +385,15 @@
           <w:rFonts w:ascii="Times New Roman" w:hAnsi="Times New Roman" w:cs="Times New Roman"/>
           <w:sz w:val="24"/>
         </w:rPr>
-        <w:t>ор оптимального варианта схе</w:t>
-      </w:r>
-      <w:bookmarkStart w:id="5" w:name="OCRUncertain017"/>
-      <w:r>
-        <w:rPr>
-          <w:rFonts w:ascii="Times New Roman" w:hAnsi="Times New Roman" w:cs="Times New Roman"/>
-          <w:sz w:val="24"/>
-        </w:rPr>
-        <w:t>м</w:t>
+        <w:t>ы электр</w:t>
+      </w:r>
+      <w:bookmarkStart w:id="5" w:name="OCRUncertain018"/>
+      <w:r>
+        <w:rPr>
+          <w:rFonts w:ascii="Times New Roman" w:hAnsi="Times New Roman" w:cs="Times New Roman"/>
+          <w:sz w:val="24"/>
+        </w:rPr>
+        <w:t>и</w:t>
       </w:r>
       <w:bookmarkEnd w:id="5"/>
       <w:r>
@@ -401,15 +401,15 @@
           <w:rFonts w:ascii="Times New Roman" w:hAnsi="Times New Roman" w:cs="Times New Roman"/>
           <w:sz w:val="24"/>
         </w:rPr>
-        <w:t>ы электр</w:t>
-      </w:r>
-      <w:bookmarkStart w:id="6" w:name="OCRUncertain018"/>
-      <w:r>
-        <w:rPr>
-          <w:rFonts w:ascii="Times New Roman" w:hAnsi="Times New Roman" w:cs="Times New Roman"/>
-          <w:sz w:val="24"/>
-        </w:rPr>
-        <w:t>и</w:t>
+        <w:t>ч</w:t>
+      </w:r>
+      <w:bookmarkStart w:id="6" w:name="OCRUncertain019"/>
+      <w:r>
+        <w:rPr>
+          <w:rFonts w:ascii="Times New Roman" w:hAnsi="Times New Roman" w:cs="Times New Roman"/>
+          <w:sz w:val="24"/>
+        </w:rPr>
+        <w:t>е</w:t>
       </w:r>
       <w:bookmarkEnd w:id="6"/>
       <w:r>
@@ -417,15 +417,15 @@
           <w:rFonts w:ascii="Times New Roman" w:hAnsi="Times New Roman" w:cs="Times New Roman"/>
           <w:sz w:val="24"/>
         </w:rPr>
-        <w:t>ч</w:t>
-      </w:r>
-      <w:bookmarkStart w:id="7" w:name="OCRUncertain019"/>
-      <w:r>
-        <w:rPr>
-          <w:rFonts w:ascii="Times New Roman" w:hAnsi="Times New Roman" w:cs="Times New Roman"/>
-          <w:sz w:val="24"/>
-        </w:rPr>
-        <w:t>е</w:t>
+        <w:t>ско</w:t>
+      </w:r>
+      <w:bookmarkStart w:id="7" w:name="OCRUncertain020"/>
+      <w:r>
+        <w:rPr>
+          <w:rFonts w:ascii="Times New Roman" w:hAnsi="Times New Roman" w:cs="Times New Roman"/>
+          <w:sz w:val="24"/>
+        </w:rPr>
+        <w:t>й</w:t>
       </w:r>
       <w:bookmarkEnd w:id="7"/>
       <w:r>
@@ -433,9 +433,9 @@
           <w:rFonts w:ascii="Times New Roman" w:hAnsi="Times New Roman" w:cs="Times New Roman"/>
           <w:sz w:val="24"/>
         </w:rPr>
-        <w:t>ско</w:t>
-      </w:r>
-      <w:bookmarkStart w:id="8" w:name="OCRUncertain020"/>
+        <w:t xml:space="preserve"> сети ра</w:t>
+      </w:r>
+      <w:bookmarkStart w:id="8" w:name="OCRUncertain021"/>
       <w:r>
         <w:rPr>
           <w:rFonts w:ascii="Times New Roman" w:hAnsi="Times New Roman" w:cs="Times New Roman"/>
@@ -449,33 +449,17 @@
           <w:rFonts w:ascii="Times New Roman" w:hAnsi="Times New Roman" w:cs="Times New Roman"/>
           <w:sz w:val="24"/>
         </w:rPr>
-        <w:t xml:space="preserve"> сети ра</w:t>
-      </w:r>
-      <w:bookmarkStart w:id="9" w:name="OCRUncertain021"/>
-      <w:r>
-        <w:rPr>
-          <w:rFonts w:ascii="Times New Roman" w:hAnsi="Times New Roman" w:cs="Times New Roman"/>
-          <w:sz w:val="24"/>
-        </w:rPr>
-        <w:t>й</w:t>
+        <w:t xml:space="preserve">она </w:t>
+      </w:r>
+      <w:bookmarkStart w:id="9" w:name="OCRUncertain022"/>
+      <w:r>
+        <w:rPr>
+          <w:rFonts w:ascii="Times New Roman" w:hAnsi="Times New Roman" w:cs="Times New Roman"/>
+          <w:sz w:val="24"/>
+        </w:rPr>
+        <w:t>н</w:t>
       </w:r>
       <w:bookmarkEnd w:id="9"/>
-      <w:r>
-        <w:rPr>
-          <w:rFonts w:ascii="Times New Roman" w:hAnsi="Times New Roman" w:cs="Times New Roman"/>
-          <w:sz w:val="24"/>
-        </w:rPr>
-        <w:t xml:space="preserve">она </w:t>
-      </w:r>
-      <w:bookmarkStart w:id="10" w:name="OCRUncertain022"/>
-      <w:r>
-        <w:rPr>
-          <w:rFonts w:ascii="Times New Roman" w:hAnsi="Times New Roman" w:cs="Times New Roman"/>
-          <w:sz w:val="24"/>
-        </w:rPr>
-        <w:t>н</w:t>
-      </w:r>
-      <w:bookmarkEnd w:id="10"/>
       <w:r>
         <w:rPr>
           <w:rFonts w:ascii="Times New Roman" w:hAnsi="Times New Roman" w:cs="Times New Roman"/>
@@ -510,7 +494,7 @@
         </w:rPr>
         <w:t xml:space="preserve"> Расчет и анализ установ</w:t>
       </w:r>
-      <w:bookmarkStart w:id="11" w:name="OCRUncertain024"/>
+      <w:bookmarkStart w:id="10" w:name="OCRUncertain024"/>
       <w:r>
         <w:rPr>
           <w:rFonts w:ascii="Times New Roman" w:hAnsi="Times New Roman" w:cs="Times New Roman"/>
@@ -519,6 +503,24 @@
         </w:rPr>
         <w:t>и</w:t>
       </w:r>
+      <w:bookmarkEnd w:id="10"/>
+      <w:r>
+        <w:rPr>
+          <w:rFonts w:ascii="Times New Roman" w:hAnsi="Times New Roman" w:cs="Times New Roman"/>
+          <w:snapToGrid w:val="0"/>
+          <w:sz w:val="24"/>
+        </w:rPr>
+        <w:t>вш</w:t>
+      </w:r>
+      <w:bookmarkStart w:id="11" w:name="OCRUncertain025"/>
+      <w:r>
+        <w:rPr>
+          <w:rFonts w:ascii="Times New Roman" w:hAnsi="Times New Roman" w:cs="Times New Roman"/>
+          <w:snapToGrid w:val="0"/>
+          <w:sz w:val="24"/>
+        </w:rPr>
+        <w:t>и</w:t>
+      </w:r>
       <w:bookmarkEnd w:id="11"/>
       <w:r>
         <w:rPr>
@@ -526,9 +528,9 @@
           <w:snapToGrid w:val="0"/>
           <w:sz w:val="24"/>
         </w:rPr>
-        <w:t>вш</w:t>
-      </w:r>
-      <w:bookmarkStart w:id="12" w:name="OCRUncertain025"/>
+        <w:t>хся реж</w:t>
+      </w:r>
+      <w:bookmarkStart w:id="12" w:name="OCRUncertain026"/>
       <w:r>
         <w:rPr>
           <w:rFonts w:ascii="Times New Roman" w:hAnsi="Times New Roman" w:cs="Times New Roman"/>
@@ -538,24 +540,6 @@
         <w:t>и</w:t>
       </w:r>
       <w:bookmarkEnd w:id="12"/>
-      <w:r>
-        <w:rPr>
-          <w:rFonts w:ascii="Times New Roman" w:hAnsi="Times New Roman" w:cs="Times New Roman"/>
-          <w:snapToGrid w:val="0"/>
-          <w:sz w:val="24"/>
-        </w:rPr>
-        <w:t>хся реж</w:t>
-      </w:r>
-      <w:bookmarkStart w:id="13" w:name="OCRUncertain026"/>
-      <w:r>
-        <w:rPr>
-          <w:rFonts w:ascii="Times New Roman" w:hAnsi="Times New Roman" w:cs="Times New Roman"/>
-          <w:snapToGrid w:val="0"/>
-          <w:sz w:val="24"/>
-        </w:rPr>
-        <w:t>и</w:t>
-      </w:r>
-      <w:bookmarkEnd w:id="13"/>
       <w:r>
         <w:rPr>
           <w:rFonts w:ascii="Times New Roman" w:hAnsi="Times New Roman" w:cs="Times New Roman"/>
@@ -591,7 +575,7 @@
         </w:rPr>
         <w:t xml:space="preserve"> </w:t>
       </w:r>
-      <w:bookmarkStart w:id="14" w:name="OCRUncertain052"/>
+      <w:bookmarkStart w:id="13" w:name="OCRUncertain052"/>
       <w:r>
         <w:rPr>
           <w:rFonts w:ascii="Times New Roman" w:hAnsi="Times New Roman" w:cs="Times New Roman"/>
@@ -600,6 +584,24 @@
         </w:rPr>
         <w:t>Определени</w:t>
       </w:r>
+      <w:bookmarkEnd w:id="13"/>
+      <w:r>
+        <w:rPr>
+          <w:rFonts w:ascii="Times New Roman" w:hAnsi="Times New Roman" w:cs="Times New Roman"/>
+          <w:snapToGrid w:val="0"/>
+          <w:sz w:val="24"/>
+        </w:rPr>
+        <w:t xml:space="preserve">е </w:t>
+      </w:r>
+      <w:bookmarkStart w:id="14" w:name="OCRUncertain053"/>
+      <w:r>
+        <w:rPr>
+          <w:rFonts w:ascii="Times New Roman" w:hAnsi="Times New Roman" w:cs="Times New Roman"/>
+          <w:snapToGrid w:val="0"/>
+          <w:sz w:val="24"/>
+        </w:rPr>
+        <w:t>технико-экономических</w:t>
+      </w:r>
       <w:bookmarkEnd w:id="14"/>
       <w:r>
         <w:rPr>
@@ -607,16 +609,16 @@
           <w:snapToGrid w:val="0"/>
           <w:sz w:val="24"/>
         </w:rPr>
-        <w:t xml:space="preserve">е </w:t>
-      </w:r>
-      <w:bookmarkStart w:id="15" w:name="OCRUncertain053"/>
-      <w:r>
-        <w:rPr>
-          <w:rFonts w:ascii="Times New Roman" w:hAnsi="Times New Roman" w:cs="Times New Roman"/>
-          <w:snapToGrid w:val="0"/>
-          <w:sz w:val="24"/>
-        </w:rPr>
-        <w:t>технико-экономических</w:t>
+        <w:t xml:space="preserve"> показа</w:t>
+      </w:r>
+      <w:bookmarkStart w:id="15" w:name="OCRUncertain054"/>
+      <w:r>
+        <w:rPr>
+          <w:rFonts w:ascii="Times New Roman" w:hAnsi="Times New Roman" w:cs="Times New Roman"/>
+          <w:snapToGrid w:val="0"/>
+          <w:sz w:val="24"/>
+        </w:rPr>
+        <w:t>теле</w:t>
       </w:r>
       <w:bookmarkEnd w:id="15"/>
       <w:r>
@@ -625,36 +627,18 @@
           <w:snapToGrid w:val="0"/>
           <w:sz w:val="24"/>
         </w:rPr>
-        <w:t xml:space="preserve"> показа</w:t>
-      </w:r>
-      <w:bookmarkStart w:id="16" w:name="OCRUncertain054"/>
-      <w:r>
-        <w:rPr>
-          <w:rFonts w:ascii="Times New Roman" w:hAnsi="Times New Roman" w:cs="Times New Roman"/>
-          <w:snapToGrid w:val="0"/>
-          <w:sz w:val="24"/>
-        </w:rPr>
-        <w:t>теле</w:t>
+        <w:t xml:space="preserve">й </w:t>
+      </w:r>
+      <w:bookmarkStart w:id="16" w:name="OCRUncertain055"/>
+      <w:r>
+        <w:rPr>
+          <w:rFonts w:ascii="Times New Roman" w:hAnsi="Times New Roman" w:cs="Times New Roman"/>
+          <w:snapToGrid w:val="0"/>
+          <w:sz w:val="24"/>
+        </w:rPr>
+        <w:t>электрическо</w:t>
       </w:r>
       <w:bookmarkEnd w:id="16"/>
-      <w:r>
-        <w:rPr>
-          <w:rFonts w:ascii="Times New Roman" w:hAnsi="Times New Roman" w:cs="Times New Roman"/>
-          <w:snapToGrid w:val="0"/>
-          <w:sz w:val="24"/>
-        </w:rPr>
-        <w:t xml:space="preserve">й </w:t>
-      </w:r>
-      <w:bookmarkStart w:id="17" w:name="OCRUncertain055"/>
-      <w:r>
-        <w:rPr>
-          <w:rFonts w:ascii="Times New Roman" w:hAnsi="Times New Roman" w:cs="Times New Roman"/>
-          <w:snapToGrid w:val="0"/>
-          <w:sz w:val="24"/>
-        </w:rPr>
-        <w:t>электрическо</w:t>
-      </w:r>
-      <w:bookmarkEnd w:id="17"/>
       <w:r>
         <w:rPr>
           <w:rFonts w:ascii="Times New Roman" w:hAnsi="Times New Roman" w:cs="Times New Roman"/>
@@ -703,7 +687,7 @@
         </w:rPr>
         <w:t xml:space="preserve"> </w:t>
       </w:r>
-      <w:bookmarkStart w:id="18" w:name="OCRUncertain056"/>
+      <w:bookmarkStart w:id="17" w:name="OCRUncertain056"/>
       <w:r>
         <w:rPr>
           <w:rFonts w:ascii="Times New Roman" w:hAnsi="Times New Roman" w:cs="Times New Roman"/>
@@ -713,6 +697,26 @@
         </w:rPr>
         <w:t>Графическая</w:t>
       </w:r>
+      <w:bookmarkEnd w:id="17"/>
+      <w:r>
+        <w:rPr>
+          <w:rFonts w:ascii="Times New Roman" w:hAnsi="Times New Roman" w:cs="Times New Roman"/>
+          <w:b/>
+          <w:snapToGrid w:val="0"/>
+          <w:sz w:val="24"/>
+        </w:rPr>
+        <w:t xml:space="preserve"> час</w:t>
+      </w:r>
+      <w:bookmarkStart w:id="18" w:name="OCRUncertain057"/>
+      <w:r>
+        <w:rPr>
+          <w:rFonts w:ascii="Times New Roman" w:hAnsi="Times New Roman" w:cs="Times New Roman"/>
+          <w:b/>
+          <w:snapToGrid w:val="0"/>
+          <w:sz w:val="24"/>
+        </w:rPr>
+        <w:t>т</w:t>
+      </w:r>
       <w:bookmarkEnd w:id="18"/>
       <w:r>
         <w:rPr>
@@ -721,9 +725,9 @@
           <w:snapToGrid w:val="0"/>
           <w:sz w:val="24"/>
         </w:rPr>
-        <w:t xml:space="preserve"> час</w:t>
-      </w:r>
-      <w:bookmarkStart w:id="19" w:name="OCRUncertain057"/>
+        <w:t>ь про</w:t>
+      </w:r>
+      <w:bookmarkStart w:id="19" w:name="OCRUncertain058"/>
       <w:r>
         <w:rPr>
           <w:rFonts w:ascii="Times New Roman" w:hAnsi="Times New Roman" w:cs="Times New Roman"/>
@@ -731,29 +735,9 @@
           <w:snapToGrid w:val="0"/>
           <w:sz w:val="24"/>
         </w:rPr>
-        <w:t>т</w:t>
+        <w:t>е</w:t>
       </w:r>
       <w:bookmarkEnd w:id="19"/>
-      <w:r>
-        <w:rPr>
-          <w:rFonts w:ascii="Times New Roman" w:hAnsi="Times New Roman" w:cs="Times New Roman"/>
-          <w:b/>
-          <w:snapToGrid w:val="0"/>
-          <w:sz w:val="24"/>
-        </w:rPr>
-        <w:t>ь про</w:t>
-      </w:r>
-      <w:bookmarkStart w:id="20" w:name="OCRUncertain058"/>
-      <w:r>
-        <w:rPr>
-          <w:rFonts w:ascii="Times New Roman" w:hAnsi="Times New Roman" w:cs="Times New Roman"/>
-          <w:b/>
-          <w:snapToGrid w:val="0"/>
-          <w:sz w:val="24"/>
-        </w:rPr>
-        <w:t>е</w:t>
-      </w:r>
-      <w:bookmarkEnd w:id="20"/>
       <w:r>
         <w:rPr>
           <w:rFonts w:ascii="Times New Roman" w:hAnsi="Times New Roman" w:cs="Times New Roman"/>
@@ -780,24 +764,60 @@
           <w:snapToGrid w:val="0"/>
           <w:sz w:val="24"/>
         </w:rPr>
-        <w:t>2.1.</w:t>
-      </w:r>
-      <w:r>
-        <w:rPr>
-          <w:rFonts w:ascii="Times New Roman" w:hAnsi="Times New Roman" w:cs="Times New Roman"/>
-          <w:snapToGrid w:val="0"/>
-          <w:sz w:val="24"/>
-        </w:rPr>
-        <w:t xml:space="preserve"> Вар</w:t>
-      </w:r>
-      <w:bookmarkStart w:id="21" w:name="OCRUncertain059"/>
-      <w:r>
-        <w:rPr>
-          <w:rFonts w:ascii="Times New Roman" w:hAnsi="Times New Roman" w:cs="Times New Roman"/>
-          <w:snapToGrid w:val="0"/>
-          <w:sz w:val="24"/>
-        </w:rPr>
-        <w:t>и</w:t>
+        <w:t>2.</w:t>
+      </w:r>
+      <w:r>
+        <w:rPr>
+          <w:rFonts w:ascii="Times New Roman" w:hAnsi="Times New Roman" w:cs="Times New Roman"/>
+          <w:noProof/>
+          <w:snapToGrid w:val="0"/>
+          <w:sz w:val="24"/>
+        </w:rPr>
+        <w:t>1</w:t>
+      </w:r>
+      <w:r>
+        <w:rPr>
+          <w:rFonts w:ascii="Times New Roman" w:hAnsi="Times New Roman" w:cs="Times New Roman"/>
+          <w:noProof/>
+          <w:snapToGrid w:val="0"/>
+          <w:sz w:val="24"/>
+        </w:rPr>
+        <w:t>.</w:t>
+      </w:r>
+      <w:r>
+        <w:rPr>
+          <w:rFonts w:ascii="Times New Roman" w:hAnsi="Times New Roman" w:cs="Times New Roman"/>
+          <w:snapToGrid w:val="0"/>
+          <w:sz w:val="24"/>
+        </w:rPr>
+        <w:t xml:space="preserve"> Схема </w:t>
+      </w:r>
+      <w:bookmarkStart w:id="20" w:name="OCRUncertain063"/>
+      <w:r>
+        <w:rPr>
+          <w:rFonts w:ascii="Times New Roman" w:hAnsi="Times New Roman" w:cs="Times New Roman"/>
+          <w:snapToGrid w:val="0"/>
+          <w:sz w:val="24"/>
+        </w:rPr>
+        <w:t>э</w:t>
+      </w:r>
+      <w:bookmarkEnd w:id="20"/>
+      <w:r>
+        <w:rPr>
+          <w:rFonts w:ascii="Times New Roman" w:hAnsi="Times New Roman" w:cs="Times New Roman"/>
+          <w:snapToGrid w:val="0"/>
+          <w:sz w:val="24"/>
+        </w:rPr>
+        <w:t>лектрической се</w:t>
+      </w:r>
+      <w:bookmarkStart w:id="21" w:name="OCRUncertain067"/>
+      <w:r>
+        <w:rPr>
+          <w:rFonts w:ascii="Times New Roman" w:hAnsi="Times New Roman" w:cs="Times New Roman"/>
+          <w:snapToGrid w:val="0"/>
+          <w:sz w:val="24"/>
+        </w:rPr>
+        <w:t>т</w:t>
       </w:r>
       <w:bookmarkEnd w:id="21"/>
       <w:r>
@@ -806,16 +826,16 @@
           <w:snapToGrid w:val="0"/>
           <w:sz w:val="24"/>
         </w:rPr>
-        <w:t>ан</w:t>
-      </w:r>
-      <w:bookmarkStart w:id="22" w:name="OCRUncertain060"/>
-      <w:r>
-        <w:rPr>
-          <w:rFonts w:ascii="Times New Roman" w:hAnsi="Times New Roman" w:cs="Times New Roman"/>
-          <w:snapToGrid w:val="0"/>
-          <w:sz w:val="24"/>
-        </w:rPr>
-        <w:t>т</w:t>
+        <w:t>и ра</w:t>
+      </w:r>
+      <w:bookmarkStart w:id="22" w:name="OCRUncertain068"/>
+      <w:r>
+        <w:rPr>
+          <w:rFonts w:ascii="Times New Roman" w:hAnsi="Times New Roman" w:cs="Times New Roman"/>
+          <w:snapToGrid w:val="0"/>
+          <w:sz w:val="24"/>
+        </w:rPr>
+        <w:t>й</w:t>
       </w:r>
       <w:bookmarkEnd w:id="22"/>
       <w:r>
@@ -824,43 +844,7 @@
           <w:snapToGrid w:val="0"/>
           <w:sz w:val="24"/>
         </w:rPr>
-        <w:t xml:space="preserve">ы </w:t>
-      </w:r>
-      <w:bookmarkStart w:id="23" w:name="OCRUncertain061"/>
-      <w:r>
-        <w:rPr>
-          <w:rFonts w:ascii="Times New Roman" w:hAnsi="Times New Roman" w:cs="Times New Roman"/>
-          <w:snapToGrid w:val="0"/>
-          <w:sz w:val="24"/>
-        </w:rPr>
-        <w:t>сооружения</w:t>
-      </w:r>
-      <w:bookmarkEnd w:id="23"/>
-      <w:r>
-        <w:rPr>
-          <w:rFonts w:ascii="Times New Roman" w:hAnsi="Times New Roman" w:cs="Times New Roman"/>
-          <w:snapToGrid w:val="0"/>
-          <w:sz w:val="24"/>
-        </w:rPr>
-        <w:t xml:space="preserve"> сет</w:t>
-      </w:r>
-      <w:bookmarkStart w:id="24" w:name="OCRUncertain062"/>
-      <w:r>
-        <w:rPr>
-          <w:rFonts w:ascii="Times New Roman" w:hAnsi="Times New Roman" w:cs="Times New Roman"/>
-          <w:snapToGrid w:val="0"/>
-          <w:sz w:val="24"/>
-        </w:rPr>
-        <w:t>и</w:t>
-      </w:r>
-      <w:bookmarkEnd w:id="24"/>
-      <w:r>
-        <w:rPr>
-          <w:rFonts w:ascii="Times New Roman" w:hAnsi="Times New Roman" w:cs="Times New Roman"/>
-          <w:snapToGrid w:val="0"/>
-          <w:sz w:val="24"/>
-        </w:rPr>
-        <w:t>.</w:t>
+        <w:t>она нагрузок.</w:t>
       </w:r>
     </w:p>
     <w:p>
@@ -868,6 +852,7 @@
         <w:spacing w:after="0" w:line="240" w:lineRule="auto"/>
         <w:rPr>
           <w:rFonts w:ascii="Times New Roman" w:hAnsi="Times New Roman" w:cs="Times New Roman"/>
+          <w:noProof/>
           <w:snapToGrid w:val="0"/>
           <w:sz w:val="24"/>
         </w:rPr>
@@ -879,24 +864,78 @@
           <w:snapToGrid w:val="0"/>
           <w:sz w:val="24"/>
         </w:rPr>
-        <w:t>2.2.</w:t>
-      </w:r>
-      <w:r>
-        <w:rPr>
-          <w:rFonts w:ascii="Times New Roman" w:hAnsi="Times New Roman" w:cs="Times New Roman"/>
-          <w:snapToGrid w:val="0"/>
-          <w:sz w:val="24"/>
-        </w:rPr>
-        <w:t xml:space="preserve"> Схема </w:t>
-      </w:r>
-      <w:bookmarkStart w:id="25" w:name="OCRUncertain063"/>
-      <w:r>
-        <w:rPr>
-          <w:rFonts w:ascii="Times New Roman" w:hAnsi="Times New Roman" w:cs="Times New Roman"/>
-          <w:snapToGrid w:val="0"/>
-          <w:sz w:val="24"/>
-        </w:rPr>
-        <w:t>э</w:t>
+        <w:t>2.</w:t>
+      </w:r>
+      <w:r>
+        <w:rPr>
+          <w:rFonts w:ascii="Times New Roman" w:hAnsi="Times New Roman" w:cs="Times New Roman"/>
+          <w:noProof/>
+          <w:snapToGrid w:val="0"/>
+          <w:sz w:val="24"/>
+        </w:rPr>
+        <w:t>2</w:t>
+      </w:r>
+      <w:r>
+        <w:rPr>
+          <w:rFonts w:ascii="Times New Roman" w:hAnsi="Times New Roman" w:cs="Times New Roman"/>
+          <w:noProof/>
+          <w:snapToGrid w:val="0"/>
+          <w:sz w:val="24"/>
+        </w:rPr>
+        <w:t>.</w:t>
+      </w:r>
+      <w:r>
+        <w:rPr>
+          <w:rFonts w:ascii="Times New Roman" w:hAnsi="Times New Roman" w:cs="Times New Roman"/>
+          <w:snapToGrid w:val="0"/>
+          <w:sz w:val="24"/>
+        </w:rPr>
+        <w:t xml:space="preserve"> Результаты расчетов установ</w:t>
+      </w:r>
+      <w:bookmarkStart w:id="23" w:name="OCRUncertain071"/>
+      <w:r>
+        <w:rPr>
+          <w:rFonts w:ascii="Times New Roman" w:hAnsi="Times New Roman" w:cs="Times New Roman"/>
+          <w:snapToGrid w:val="0"/>
+          <w:sz w:val="24"/>
+        </w:rPr>
+        <w:t>и</w:t>
+      </w:r>
+      <w:bookmarkEnd w:id="23"/>
+      <w:r>
+        <w:rPr>
+          <w:rFonts w:ascii="Times New Roman" w:hAnsi="Times New Roman" w:cs="Times New Roman"/>
+          <w:snapToGrid w:val="0"/>
+          <w:sz w:val="24"/>
+        </w:rPr>
+        <w:t>вш</w:t>
+      </w:r>
+      <w:bookmarkStart w:id="24" w:name="OCRUncertain072"/>
+      <w:r>
+        <w:rPr>
+          <w:rFonts w:ascii="Times New Roman" w:hAnsi="Times New Roman" w:cs="Times New Roman"/>
+          <w:snapToGrid w:val="0"/>
+          <w:sz w:val="24"/>
+        </w:rPr>
+        <w:t>и</w:t>
+      </w:r>
+      <w:bookmarkEnd w:id="24"/>
+      <w:r>
+        <w:rPr>
+          <w:rFonts w:ascii="Times New Roman" w:hAnsi="Times New Roman" w:cs="Times New Roman"/>
+          <w:snapToGrid w:val="0"/>
+          <w:sz w:val="24"/>
+        </w:rPr>
+        <w:t>хся ре</w:t>
+      </w:r>
+      <w:bookmarkStart w:id="25" w:name="OCRUncertain073"/>
+      <w:r>
+        <w:rPr>
+          <w:rFonts w:ascii="Times New Roman" w:hAnsi="Times New Roman" w:cs="Times New Roman"/>
+          <w:snapToGrid w:val="0"/>
+          <w:sz w:val="24"/>
+        </w:rPr>
+        <w:t>жи</w:t>
       </w:r>
       <w:bookmarkEnd w:id="25"/>
       <w:r>
@@ -905,16 +944,16 @@
           <w:snapToGrid w:val="0"/>
           <w:sz w:val="24"/>
         </w:rPr>
-        <w:t>лектрической се</w:t>
-      </w:r>
-      <w:bookmarkStart w:id="26" w:name="OCRUncertain067"/>
-      <w:r>
-        <w:rPr>
-          <w:rFonts w:ascii="Times New Roman" w:hAnsi="Times New Roman" w:cs="Times New Roman"/>
-          <w:snapToGrid w:val="0"/>
-          <w:sz w:val="24"/>
-        </w:rPr>
-        <w:t>т</w:t>
+        <w:t>мов сети. Об</w:t>
+      </w:r>
+      <w:bookmarkStart w:id="26" w:name="OCRUncertain074"/>
+      <w:r>
+        <w:rPr>
+          <w:rFonts w:ascii="Times New Roman" w:hAnsi="Times New Roman" w:cs="Times New Roman"/>
+          <w:snapToGrid w:val="0"/>
+          <w:sz w:val="24"/>
+        </w:rPr>
+        <w:t>ъ</w:t>
       </w:r>
       <w:bookmarkEnd w:id="26"/>
       <w:r>
@@ -923,153 +962,35 @@
           <w:snapToGrid w:val="0"/>
           <w:sz w:val="24"/>
         </w:rPr>
-        <w:t>и ра</w:t>
-      </w:r>
-      <w:bookmarkStart w:id="27" w:name="OCRUncertain068"/>
-      <w:r>
-        <w:rPr>
-          <w:rFonts w:ascii="Times New Roman" w:hAnsi="Times New Roman" w:cs="Times New Roman"/>
-          <w:snapToGrid w:val="0"/>
-          <w:sz w:val="24"/>
-        </w:rPr>
-        <w:t>й</w:t>
+        <w:t>ем</w:t>
+      </w:r>
+      <w:r>
+        <w:rPr>
+          <w:rFonts w:ascii="Times New Roman" w:hAnsi="Times New Roman" w:cs="Times New Roman"/>
+          <w:noProof/>
+          <w:snapToGrid w:val="0"/>
+          <w:sz w:val="24"/>
+        </w:rPr>
+        <w:t xml:space="preserve"> - 1</w:t>
+      </w:r>
+      <w:r>
+        <w:rPr>
+          <w:rFonts w:ascii="Times New Roman" w:hAnsi="Times New Roman" w:cs="Times New Roman"/>
+          <w:snapToGrid w:val="0"/>
+          <w:sz w:val="24"/>
+        </w:rPr>
+        <w:t xml:space="preserve"> </w:t>
+      </w:r>
+      <w:bookmarkStart w:id="27" w:name="OCRUncertain075"/>
+      <w:r>
+        <w:rPr>
+          <w:rFonts w:ascii="Times New Roman" w:hAnsi="Times New Roman" w:cs="Times New Roman"/>
+          <w:snapToGrid w:val="0"/>
+          <w:sz w:val="24"/>
+        </w:rPr>
+        <w:t>лист</w:t>
       </w:r>
       <w:bookmarkEnd w:id="27"/>
-      <w:r>
-        <w:rPr>
-          <w:rFonts w:ascii="Times New Roman" w:hAnsi="Times New Roman" w:cs="Times New Roman"/>
-          <w:snapToGrid w:val="0"/>
-          <w:sz w:val="24"/>
-        </w:rPr>
-        <w:t>она нагрузок.</w:t>
-      </w:r>
-    </w:p>
-    <w:p>
-      <w:pPr>
-        <w:spacing w:after="0" w:line="240" w:lineRule="auto"/>
-        <w:rPr>
-          <w:rFonts w:ascii="Times New Roman" w:hAnsi="Times New Roman" w:cs="Times New Roman"/>
-          <w:noProof/>
-          <w:snapToGrid w:val="0"/>
-          <w:sz w:val="24"/>
-        </w:rPr>
-      </w:pPr>
-      <w:r>
-        <w:rPr>
-          <w:rFonts w:ascii="Times New Roman" w:hAnsi="Times New Roman" w:cs="Times New Roman"/>
-          <w:noProof/>
-          <w:snapToGrid w:val="0"/>
-          <w:sz w:val="24"/>
-        </w:rPr>
-        <w:t>2.3.</w:t>
-      </w:r>
-      <w:r>
-        <w:rPr>
-          <w:rFonts w:ascii="Times New Roman" w:hAnsi="Times New Roman" w:cs="Times New Roman"/>
-          <w:snapToGrid w:val="0"/>
-          <w:sz w:val="24"/>
-        </w:rPr>
-        <w:t xml:space="preserve"> Результаты расчетов установ</w:t>
-      </w:r>
-      <w:bookmarkStart w:id="28" w:name="OCRUncertain071"/>
-      <w:r>
-        <w:rPr>
-          <w:rFonts w:ascii="Times New Roman" w:hAnsi="Times New Roman" w:cs="Times New Roman"/>
-          <w:snapToGrid w:val="0"/>
-          <w:sz w:val="24"/>
-        </w:rPr>
-        <w:t>и</w:t>
-      </w:r>
-      <w:bookmarkEnd w:id="28"/>
-      <w:r>
-        <w:rPr>
-          <w:rFonts w:ascii="Times New Roman" w:hAnsi="Times New Roman" w:cs="Times New Roman"/>
-          <w:snapToGrid w:val="0"/>
-          <w:sz w:val="24"/>
-        </w:rPr>
-        <w:t>вш</w:t>
-      </w:r>
-      <w:bookmarkStart w:id="29" w:name="OCRUncertain072"/>
-      <w:r>
-        <w:rPr>
-          <w:rFonts w:ascii="Times New Roman" w:hAnsi="Times New Roman" w:cs="Times New Roman"/>
-          <w:snapToGrid w:val="0"/>
-          <w:sz w:val="24"/>
-        </w:rPr>
-        <w:t>и</w:t>
-      </w:r>
-      <w:bookmarkEnd w:id="29"/>
-      <w:r>
-        <w:rPr>
-          <w:rFonts w:ascii="Times New Roman" w:hAnsi="Times New Roman" w:cs="Times New Roman"/>
-          <w:snapToGrid w:val="0"/>
-          <w:sz w:val="24"/>
-        </w:rPr>
-        <w:t>хся ре</w:t>
-      </w:r>
-      <w:bookmarkStart w:id="30" w:name="OCRUncertain073"/>
-      <w:r>
-        <w:rPr>
-          <w:rFonts w:ascii="Times New Roman" w:hAnsi="Times New Roman" w:cs="Times New Roman"/>
-          <w:snapToGrid w:val="0"/>
-          <w:sz w:val="24"/>
-        </w:rPr>
-        <w:t>жи</w:t>
-      </w:r>
-      <w:bookmarkEnd w:id="30"/>
-      <w:r>
-        <w:rPr>
-          <w:rFonts w:ascii="Times New Roman" w:hAnsi="Times New Roman" w:cs="Times New Roman"/>
-          <w:snapToGrid w:val="0"/>
-          <w:sz w:val="24"/>
-        </w:rPr>
-        <w:t>мов сети. Об</w:t>
-      </w:r>
-      <w:bookmarkStart w:id="31" w:name="OCRUncertain074"/>
-      <w:r>
-        <w:rPr>
-          <w:rFonts w:ascii="Times New Roman" w:hAnsi="Times New Roman" w:cs="Times New Roman"/>
-          <w:snapToGrid w:val="0"/>
-          <w:sz w:val="24"/>
-        </w:rPr>
-        <w:t>ъ</w:t>
-      </w:r>
-      <w:bookmarkEnd w:id="31"/>
-      <w:r>
-        <w:rPr>
-          <w:rFonts w:ascii="Times New Roman" w:hAnsi="Times New Roman" w:cs="Times New Roman"/>
-          <w:snapToGrid w:val="0"/>
-          <w:sz w:val="24"/>
-        </w:rPr>
-        <w:t>ем</w:t>
-      </w:r>
-      <w:r>
-        <w:rPr>
-          <w:rFonts w:ascii="Times New Roman" w:hAnsi="Times New Roman" w:cs="Times New Roman"/>
-          <w:noProof/>
-          <w:snapToGrid w:val="0"/>
-          <w:sz w:val="24"/>
-        </w:rPr>
-        <w:t xml:space="preserve"> - 1</w:t>
-      </w:r>
-      <w:r>
-        <w:rPr>
-          <w:rFonts w:ascii="Times New Roman" w:hAnsi="Times New Roman" w:cs="Times New Roman"/>
-          <w:snapToGrid w:val="0"/>
-          <w:sz w:val="24"/>
-        </w:rPr>
-        <w:t xml:space="preserve"> </w:t>
-      </w:r>
-      <w:bookmarkStart w:id="32" w:name="OCRUncertain075"/>
-      <w:r>
-        <w:rPr>
-          <w:rFonts w:ascii="Times New Roman" w:hAnsi="Times New Roman" w:cs="Times New Roman"/>
-          <w:snapToGrid w:val="0"/>
-          <w:sz w:val="24"/>
-        </w:rPr>
-        <w:t>лист</w:t>
-      </w:r>
-      <w:bookmarkEnd w:id="32"/>
       <w:r>
         <w:rPr>
           <w:rFonts w:ascii="Times New Roman" w:hAnsi="Times New Roman" w:cs="Times New Roman"/>
@@ -1128,7 +1049,7 @@
         </w:rPr>
         <w:t xml:space="preserve"> </w:t>
       </w:r>
-      <w:bookmarkStart w:id="33" w:name="OCRUncertain076"/>
+      <w:bookmarkStart w:id="28" w:name="OCRUncertain076"/>
       <w:r>
         <w:rPr>
           <w:rFonts w:ascii="Times New Roman" w:hAnsi="Times New Roman" w:cs="Times New Roman"/>
@@ -1138,7 +1059,7 @@
         </w:rPr>
         <w:t>И</w:t>
       </w:r>
-      <w:bookmarkEnd w:id="33"/>
+      <w:bookmarkEnd w:id="28"/>
       <w:r>
         <w:rPr>
           <w:rFonts w:ascii="Times New Roman" w:hAnsi="Times New Roman" w:cs="Times New Roman"/>
@@ -1148,7 +1069,7 @@
         </w:rPr>
         <w:t>с</w:t>
       </w:r>
-      <w:bookmarkStart w:id="34" w:name="OCRUncertain077"/>
+      <w:bookmarkStart w:id="29" w:name="OCRUncertain077"/>
       <w:r>
         <w:rPr>
           <w:rFonts w:ascii="Times New Roman" w:hAnsi="Times New Roman" w:cs="Times New Roman"/>
@@ -1158,7 +1079,7 @@
         </w:rPr>
         <w:t>х</w:t>
       </w:r>
-      <w:bookmarkEnd w:id="34"/>
+      <w:bookmarkEnd w:id="29"/>
       <w:r>
         <w:rPr>
           <w:rFonts w:ascii="Times New Roman" w:hAnsi="Times New Roman" w:cs="Times New Roman"/>
@@ -1168,7 +1089,7 @@
         </w:rPr>
         <w:t xml:space="preserve">одные </w:t>
       </w:r>
-      <w:bookmarkStart w:id="35" w:name="OCRUncertain078"/>
+      <w:bookmarkStart w:id="30" w:name="OCRUncertain078"/>
       <w:r>
         <w:rPr>
           <w:rFonts w:ascii="Times New Roman" w:hAnsi="Times New Roman" w:cs="Times New Roman"/>
@@ -1178,7 +1099,7 @@
         </w:rPr>
         <w:t>данные.</w:t>
       </w:r>
-      <w:bookmarkEnd w:id="35"/>
+      <w:bookmarkEnd w:id="30"/>
     </w:p>
     <w:p>
       <w:pPr>
@@ -1216,7 +1137,7 @@
           <v:shape id="_x0000_s1028" type="#_x0000_t75" style="position:absolute;margin-left:27.1pt;margin-top:12.45pt;width:427.35pt;height:230.2pt;z-index:-251658752;mso-position-horizontal-relative:text;mso-position-vertical-relative:text" fillcolor="white [3212]" strokecolor="#e7e6e6 [3214]">
             <v:imagedata r:id="rId4" o:title="" croptop="1808f" cropbottom="34352f" cropleft="3621f" cropright="7242f"/>
           </v:shape>
-          <o:OLEObject Type="Embed" ProgID="Visio.Drawing.15" ShapeID="_x0000_s1028" DrawAspect="Content" ObjectID="_1831550735" r:id="rId5"/>
+          <o:OLEObject Type="Embed" ProgID="Visio.Drawing.15" ShapeID="_x0000_s1028" DrawAspect="Content" ObjectID="_1832933364" r:id="rId5"/>
         </w:object>
       </w:r>
       <w:r>
@@ -1228,7 +1149,7 @@
         </w:rPr>
         <w:t>3.</w:t>
       </w:r>
-      <w:bookmarkStart w:id="36" w:name="OCRUncertain079"/>
+      <w:bookmarkStart w:id="31" w:name="OCRUncertain079"/>
       <w:r>
         <w:rPr>
           <w:rFonts w:ascii="Times New Roman" w:hAnsi="Times New Roman" w:cs="Times New Roman"/>
@@ -1238,6 +1159,96 @@
         </w:rPr>
         <w:t>1.</w:t>
       </w:r>
+      <w:bookmarkEnd w:id="31"/>
+      <w:r>
+        <w:rPr>
+          <w:rFonts w:ascii="Times New Roman" w:hAnsi="Times New Roman" w:cs="Times New Roman"/>
+          <w:snapToGrid w:val="0"/>
+          <w:sz w:val="24"/>
+        </w:rPr>
+        <w:t xml:space="preserve"> План </w:t>
+      </w:r>
+      <w:bookmarkStart w:id="32" w:name="OCRUncertain080"/>
+      <w:r>
+        <w:rPr>
+          <w:rFonts w:ascii="Times New Roman" w:hAnsi="Times New Roman" w:cs="Times New Roman"/>
+          <w:snapToGrid w:val="0"/>
+          <w:sz w:val="24"/>
+        </w:rPr>
+        <w:t>расположения</w:t>
+      </w:r>
+      <w:bookmarkEnd w:id="32"/>
+      <w:r>
+        <w:rPr>
+          <w:rFonts w:ascii="Times New Roman" w:hAnsi="Times New Roman" w:cs="Times New Roman"/>
+          <w:snapToGrid w:val="0"/>
+          <w:sz w:val="24"/>
+        </w:rPr>
+        <w:t xml:space="preserve"> </w:t>
+      </w:r>
+      <w:bookmarkStart w:id="33" w:name="OCRUncertain081"/>
+      <w:r>
+        <w:rPr>
+          <w:rFonts w:ascii="Times New Roman" w:hAnsi="Times New Roman" w:cs="Times New Roman"/>
+          <w:snapToGrid w:val="0"/>
+          <w:sz w:val="24"/>
+        </w:rPr>
+        <w:t>источников</w:t>
+      </w:r>
+      <w:bookmarkEnd w:id="33"/>
+      <w:r>
+        <w:rPr>
+          <w:rFonts w:ascii="Times New Roman" w:hAnsi="Times New Roman" w:cs="Times New Roman"/>
+          <w:snapToGrid w:val="0"/>
+          <w:sz w:val="24"/>
+        </w:rPr>
+        <w:t xml:space="preserve"> </w:t>
+      </w:r>
+      <w:bookmarkStart w:id="34" w:name="OCRUncertain082"/>
+      <w:r>
+        <w:rPr>
+          <w:rFonts w:ascii="Times New Roman" w:hAnsi="Times New Roman" w:cs="Times New Roman"/>
+          <w:snapToGrid w:val="0"/>
+          <w:sz w:val="24"/>
+        </w:rPr>
+        <w:t>питания</w:t>
+      </w:r>
+      <w:bookmarkEnd w:id="34"/>
+      <w:r>
+        <w:rPr>
+          <w:rFonts w:ascii="Times New Roman" w:hAnsi="Times New Roman" w:cs="Times New Roman"/>
+          <w:snapToGrid w:val="0"/>
+          <w:sz w:val="24"/>
+        </w:rPr>
+        <w:t xml:space="preserve"> </w:t>
+      </w:r>
+      <w:bookmarkStart w:id="35" w:name="OCRUncertain083"/>
+      <w:r>
+        <w:rPr>
+          <w:rFonts w:ascii="Times New Roman" w:hAnsi="Times New Roman" w:cs="Times New Roman"/>
+          <w:snapToGrid w:val="0"/>
+          <w:sz w:val="24"/>
+        </w:rPr>
+        <w:t>на</w:t>
+      </w:r>
+      <w:bookmarkEnd w:id="35"/>
+      <w:r>
+        <w:rPr>
+          <w:rFonts w:ascii="Times New Roman" w:hAnsi="Times New Roman" w:cs="Times New Roman"/>
+          <w:snapToGrid w:val="0"/>
+          <w:sz w:val="24"/>
+        </w:rPr>
+        <w:t>гр</w:t>
+      </w:r>
+      <w:bookmarkStart w:id="36" w:name="OCRUncertain084"/>
+      <w:r>
+        <w:rPr>
+          <w:rFonts w:ascii="Times New Roman" w:hAnsi="Times New Roman" w:cs="Times New Roman"/>
+          <w:snapToGrid w:val="0"/>
+          <w:sz w:val="24"/>
+        </w:rPr>
+        <w:t>у</w:t>
+      </w:r>
       <w:bookmarkEnd w:id="36"/>
       <w:r>
         <w:rPr>
@@ -1245,16 +1256,16 @@
           <w:snapToGrid w:val="0"/>
           <w:sz w:val="24"/>
         </w:rPr>
-        <w:t xml:space="preserve"> План </w:t>
-      </w:r>
-      <w:bookmarkStart w:id="37" w:name="OCRUncertain080"/>
-      <w:r>
-        <w:rPr>
-          <w:rFonts w:ascii="Times New Roman" w:hAnsi="Times New Roman" w:cs="Times New Roman"/>
-          <w:snapToGrid w:val="0"/>
-          <w:sz w:val="24"/>
-        </w:rPr>
-        <w:t>расположения</w:t>
+        <w:t>зо</w:t>
+      </w:r>
+      <w:bookmarkStart w:id="37" w:name="OCRUncertain085"/>
+      <w:r>
+        <w:rPr>
+          <w:rFonts w:ascii="Times New Roman" w:hAnsi="Times New Roman" w:cs="Times New Roman"/>
+          <w:snapToGrid w:val="0"/>
+          <w:sz w:val="24"/>
+        </w:rPr>
+        <w:t>к</w:t>
       </w:r>
       <w:bookmarkEnd w:id="37"/>
       <w:r>
@@ -1263,108 +1274,18 @@
           <w:snapToGrid w:val="0"/>
           <w:sz w:val="24"/>
         </w:rPr>
-        <w:t xml:space="preserve"> </w:t>
-      </w:r>
-      <w:bookmarkStart w:id="38" w:name="OCRUncertain081"/>
-      <w:r>
-        <w:rPr>
-          <w:rFonts w:ascii="Times New Roman" w:hAnsi="Times New Roman" w:cs="Times New Roman"/>
-          <w:snapToGrid w:val="0"/>
-          <w:sz w:val="24"/>
-        </w:rPr>
-        <w:t>источников</w:t>
+        <w:t xml:space="preserve"> ра</w:t>
+      </w:r>
+      <w:bookmarkStart w:id="38" w:name="OCRUncertain086"/>
+      <w:r>
+        <w:rPr>
+          <w:rFonts w:ascii="Times New Roman" w:hAnsi="Times New Roman" w:cs="Times New Roman"/>
+          <w:snapToGrid w:val="0"/>
+          <w:sz w:val="24"/>
+        </w:rPr>
+        <w:t>й</w:t>
       </w:r>
       <w:bookmarkEnd w:id="38"/>
-      <w:r>
-        <w:rPr>
-          <w:rFonts w:ascii="Times New Roman" w:hAnsi="Times New Roman" w:cs="Times New Roman"/>
-          <w:snapToGrid w:val="0"/>
-          <w:sz w:val="24"/>
-        </w:rPr>
-        <w:t xml:space="preserve"> </w:t>
-      </w:r>
-      <w:bookmarkStart w:id="39" w:name="OCRUncertain082"/>
-      <w:r>
-        <w:rPr>
-          <w:rFonts w:ascii="Times New Roman" w:hAnsi="Times New Roman" w:cs="Times New Roman"/>
-          <w:snapToGrid w:val="0"/>
-          <w:sz w:val="24"/>
-        </w:rPr>
-        <w:t>питания</w:t>
-      </w:r>
-      <w:bookmarkEnd w:id="39"/>
-      <w:r>
-        <w:rPr>
-          <w:rFonts w:ascii="Times New Roman" w:hAnsi="Times New Roman" w:cs="Times New Roman"/>
-          <w:snapToGrid w:val="0"/>
-          <w:sz w:val="24"/>
-        </w:rPr>
-        <w:t xml:space="preserve"> </w:t>
-      </w:r>
-      <w:bookmarkStart w:id="40" w:name="OCRUncertain083"/>
-      <w:r>
-        <w:rPr>
-          <w:rFonts w:ascii="Times New Roman" w:hAnsi="Times New Roman" w:cs="Times New Roman"/>
-          <w:snapToGrid w:val="0"/>
-          <w:sz w:val="24"/>
-        </w:rPr>
-        <w:t>на</w:t>
-      </w:r>
-      <w:bookmarkEnd w:id="40"/>
-      <w:r>
-        <w:rPr>
-          <w:rFonts w:ascii="Times New Roman" w:hAnsi="Times New Roman" w:cs="Times New Roman"/>
-          <w:snapToGrid w:val="0"/>
-          <w:sz w:val="24"/>
-        </w:rPr>
-        <w:t>гр</w:t>
-      </w:r>
-      <w:bookmarkStart w:id="41" w:name="OCRUncertain084"/>
-      <w:r>
-        <w:rPr>
-          <w:rFonts w:ascii="Times New Roman" w:hAnsi="Times New Roman" w:cs="Times New Roman"/>
-          <w:snapToGrid w:val="0"/>
-          <w:sz w:val="24"/>
-        </w:rPr>
-        <w:t>у</w:t>
-      </w:r>
-      <w:bookmarkEnd w:id="41"/>
-      <w:r>
-        <w:rPr>
-          <w:rFonts w:ascii="Times New Roman" w:hAnsi="Times New Roman" w:cs="Times New Roman"/>
-          <w:snapToGrid w:val="0"/>
-          <w:sz w:val="24"/>
-        </w:rPr>
-        <w:t>зо</w:t>
-      </w:r>
-      <w:bookmarkStart w:id="42" w:name="OCRUncertain085"/>
-      <w:r>
-        <w:rPr>
-          <w:rFonts w:ascii="Times New Roman" w:hAnsi="Times New Roman" w:cs="Times New Roman"/>
-          <w:snapToGrid w:val="0"/>
-          <w:sz w:val="24"/>
-        </w:rPr>
-        <w:t>к</w:t>
-      </w:r>
-      <w:bookmarkEnd w:id="42"/>
-      <w:r>
-        <w:rPr>
-          <w:rFonts w:ascii="Times New Roman" w:hAnsi="Times New Roman" w:cs="Times New Roman"/>
-          <w:snapToGrid w:val="0"/>
-          <w:sz w:val="24"/>
-        </w:rPr>
-        <w:t xml:space="preserve"> ра</w:t>
-      </w:r>
-      <w:bookmarkStart w:id="43" w:name="OCRUncertain086"/>
-      <w:r>
-        <w:rPr>
-          <w:rFonts w:ascii="Times New Roman" w:hAnsi="Times New Roman" w:cs="Times New Roman"/>
-          <w:snapToGrid w:val="0"/>
-          <w:sz w:val="24"/>
-        </w:rPr>
-        <w:t>й</w:t>
-      </w:r>
-      <w:bookmarkEnd w:id="43"/>
       <w:r>
         <w:rPr>
           <w:rFonts w:ascii="Times New Roman" w:hAnsi="Times New Roman" w:cs="Times New Roman"/>
@@ -6837,7 +6758,7 @@
                 <w:szCs w:val="24"/>
                 <w:lang w:eastAsia="ru-RU"/>
               </w:rPr>
-              <w:t>1</w:t>
+              <w:t>5</w:t>
             </w:r>
           </w:p>
         </w:tc>
@@ -7016,6 +6937,79 @@
               </w:rPr>
               <w:t>2</w:t>
             </w:r>
+          </w:p>
+        </w:tc>
+      </w:tr>
+      <w:tr>
+        <w:trPr>
+          <w:trHeight w:val="402"/>
+          <w:jc w:val="center"/>
+        </w:trPr>
+        <w:tc>
+          <w:tcPr>
+            <w:tcW w:w="3920" w:type="dxa"/>
+            <w:gridSpan w:val="5"/>
+            <w:tcBorders>
+              <w:top w:val="single" w:sz="12" w:space="0" w:color="auto"/>
+              <w:left w:val="single" w:sz="12" w:space="0" w:color="auto"/>
+              <w:bottom w:val="single" w:sz="12" w:space="0" w:color="auto"/>
+              <w:right w:val="single" w:sz="12" w:space="0" w:color="auto"/>
+            </w:tcBorders>
+            <w:shd w:val="clear" w:color="auto" w:fill="auto"/>
+            <w:vAlign w:val="center"/>
+          </w:tcPr>
+          <w:p>
+            <w:pPr>
+              <w:spacing w:after="0" w:line="240" w:lineRule="auto"/>
+              <w:jc w:val="center"/>
+              <w:rPr>
+                <w:rFonts w:ascii="Times New Roman" w:eastAsia="Times New Roman" w:hAnsi="Times New Roman" w:cs="Times New Roman"/>
+                <w:b/>
+                <w:bCs/>
+                <w:sz w:val="24"/>
+                <w:szCs w:val="24"/>
+                <w:lang w:eastAsia="ru-RU"/>
+              </w:rPr>
+            </w:pPr>
+            <w:r>
+              <w:rPr>
+                <w:rFonts w:ascii="Times New Roman" w:eastAsia="Times New Roman" w:hAnsi="Times New Roman" w:cs="Times New Roman"/>
+                <w:b/>
+                <w:bCs/>
+                <w:sz w:val="24"/>
+                <w:szCs w:val="24"/>
+                <w:lang w:eastAsia="ru-RU"/>
+              </w:rPr>
+              <w:t>Тип станции</w:t>
+            </w:r>
+          </w:p>
+        </w:tc>
+        <w:tc>
+          <w:tcPr>
+            <w:tcW w:w="6193" w:type="dxa"/>
+            <w:gridSpan w:val="6"/>
+            <w:tcBorders>
+              <w:top w:val="single" w:sz="12" w:space="0" w:color="auto"/>
+              <w:left w:val="single" w:sz="12" w:space="0" w:color="auto"/>
+              <w:bottom w:val="single" w:sz="12" w:space="0" w:color="auto"/>
+              <w:right w:val="single" w:sz="12" w:space="0" w:color="auto"/>
+            </w:tcBorders>
+            <w:shd w:val="clear" w:color="auto" w:fill="auto"/>
+            <w:vAlign w:val="center"/>
+          </w:tcPr>
+          <w:p>
+            <w:pPr>
+              <w:spacing w:after="0" w:line="240" w:lineRule="auto"/>
+              <w:jc w:val="center"/>
+              <w:rPr>
+                <w:rFonts w:ascii="Times New Roman" w:eastAsia="Times New Roman" w:hAnsi="Times New Roman" w:cs="Times New Roman"/>
+                <w:b/>
+                <w:bCs/>
+                <w:sz w:val="24"/>
+                <w:szCs w:val="24"/>
+                <w:lang w:eastAsia="ru-RU"/>
+              </w:rPr>
+            </w:pPr>
           </w:p>
         </w:tc>
       </w:tr>
@@ -7040,7 +7034,7 @@
           <w:lang w:eastAsia="ru-RU"/>
         </w:rPr>
       </w:pPr>
-      <w:bookmarkStart w:id="44" w:name="RANGE!A11"/>
+      <w:bookmarkStart w:id="39" w:name="RANGE!A11"/>
       <w:r>
         <w:rPr>
           <w:rFonts w:ascii="Times New Roman" w:eastAsia="Times New Roman" w:hAnsi="Times New Roman" w:cs="Times New Roman"/>
@@ -7050,7 +7044,7 @@
         </w:rPr>
         <w:t>3.3. Данные об источниках питания.</w:t>
       </w:r>
-      <w:bookmarkEnd w:id="44"/>
+      <w:bookmarkEnd w:id="39"/>
     </w:p>
     <w:p>
       <w:pPr>
@@ -7069,9 +7063,8 @@
           <w:szCs w:val="24"/>
           <w:lang w:eastAsia="ru-RU"/>
         </w:rPr>
-        <w:t xml:space="preserve">3.3.1. Электроснабжение района нагрузок планируется осуществить с шин 110 или 220 </w:t>
-      </w:r>
-      <w:proofErr w:type="spellStart"/>
+        <w:t>3.3.1. Электроснабжение района нагрузок планируется осуществить с шин 110</w:t>
+      </w:r>
       <w:r>
         <w:rPr>
           <w:rFonts w:ascii="Times New Roman" w:eastAsia="Times New Roman" w:hAnsi="Times New Roman" w:cs="Times New Roman"/>
@@ -7079,9 +7072,8 @@
           <w:szCs w:val="24"/>
           <w:lang w:eastAsia="ru-RU"/>
         </w:rPr>
-        <w:t>кВ</w:t>
-      </w:r>
-      <w:proofErr w:type="spellEnd"/>
+        <w:t>/</w:t>
+      </w:r>
       <w:r>
         <w:rPr>
           <w:rFonts w:ascii="Times New Roman" w:eastAsia="Times New Roman" w:hAnsi="Times New Roman" w:cs="Times New Roman"/>
@@ -7089,7 +7081,72 @@
           <w:szCs w:val="24"/>
           <w:lang w:eastAsia="ru-RU"/>
         </w:rPr>
-        <w:t xml:space="preserve"> действующей подстанции А энергосистемы. </w:t>
+        <w:t>220</w:t>
+      </w:r>
+      <w:r>
+        <w:rPr>
+          <w:rFonts w:ascii="Times New Roman" w:eastAsia="Times New Roman" w:hAnsi="Times New Roman" w:cs="Times New Roman"/>
+          <w:sz w:val="24"/>
+          <w:szCs w:val="24"/>
+          <w:lang w:eastAsia="ru-RU"/>
+        </w:rPr>
+        <w:t>/</w:t>
+      </w:r>
+      <w:r>
+        <w:rPr>
+          <w:rFonts w:ascii="Times New Roman" w:eastAsia="Times New Roman" w:hAnsi="Times New Roman" w:cs="Times New Roman"/>
+          <w:sz w:val="24"/>
+          <w:szCs w:val="24"/>
+          <w:lang w:eastAsia="ru-RU"/>
+        </w:rPr>
+        <w:t>330</w:t>
+      </w:r>
+      <w:r>
+        <w:rPr>
+          <w:rFonts w:ascii="Times New Roman" w:eastAsia="Times New Roman" w:hAnsi="Times New Roman" w:cs="Times New Roman"/>
+          <w:sz w:val="24"/>
+          <w:szCs w:val="24"/>
+          <w:lang w:eastAsia="ru-RU"/>
+        </w:rPr>
+        <w:t xml:space="preserve"> </w:t>
+      </w:r>
+      <w:proofErr w:type="spellStart"/>
+      <w:r>
+        <w:rPr>
+          <w:rFonts w:ascii="Times New Roman" w:eastAsia="Times New Roman" w:hAnsi="Times New Roman" w:cs="Times New Roman"/>
+          <w:sz w:val="24"/>
+          <w:szCs w:val="24"/>
+          <w:lang w:eastAsia="ru-RU"/>
+        </w:rPr>
+        <w:t>кВ</w:t>
+      </w:r>
+      <w:proofErr w:type="spellEnd"/>
+      <w:r>
+        <w:rPr>
+          <w:rFonts w:ascii="Times New Roman" w:eastAsia="Times New Roman" w:hAnsi="Times New Roman" w:cs="Times New Roman"/>
+          <w:sz w:val="24"/>
+          <w:szCs w:val="24"/>
+          <w:lang w:eastAsia="ru-RU"/>
+        </w:rPr>
+        <w:t xml:space="preserve"> </w:t>
+      </w:r>
+      <w:r>
+        <w:rPr>
+          <w:rFonts w:ascii="Times New Roman" w:eastAsia="Times New Roman" w:hAnsi="Times New Roman" w:cs="Times New Roman"/>
+          <w:sz w:val="24"/>
+          <w:szCs w:val="24"/>
+          <w:lang w:eastAsia="ru-RU"/>
+        </w:rPr>
+        <w:t>с электростанции (узел 5)</w:t>
+      </w:r>
+      <w:r>
+        <w:rPr>
+          <w:rFonts w:ascii="Times New Roman" w:eastAsia="Times New Roman" w:hAnsi="Times New Roman" w:cs="Times New Roman"/>
+          <w:sz w:val="24"/>
+          <w:szCs w:val="24"/>
+          <w:lang w:eastAsia="ru-RU"/>
+        </w:rPr>
+        <w:t>.</w:t>
       </w:r>
     </w:p>
     <w:p>
@@ -7102,7 +7159,7 @@
           <w:lang w:eastAsia="ru-RU"/>
         </w:rPr>
       </w:pPr>
-      <w:bookmarkStart w:id="45" w:name="RANGE!A13"/>
+      <w:bookmarkStart w:id="40" w:name="RANGE!A13"/>
       <w:r>
         <w:rPr>
           <w:rFonts w:ascii="Times New Roman" w:eastAsia="Times New Roman" w:hAnsi="Times New Roman" w:cs="Times New Roman"/>
@@ -7112,7 +7169,7 @@
         </w:rPr>
         <w:t>3.3.2. Уровни напряжения на шинах ПС А:</w:t>
       </w:r>
-      <w:bookmarkEnd w:id="45"/>
+      <w:bookmarkEnd w:id="40"/>
     </w:p>
     <w:tbl>
       <w:tblPr>
@@ -7629,6 +7686,573 @@
       <w:pPr>
         <w:spacing w:after="0" w:line="240" w:lineRule="auto"/>
         <w:rPr>
+          <w:rFonts w:ascii="Times New Roman" w:eastAsia="Times New Roman" w:hAnsi="Times New Roman" w:cs="Times New Roman"/>
+          <w:sz w:val="24"/>
+          <w:szCs w:val="24"/>
+          <w:lang w:eastAsia="ru-RU"/>
+        </w:rPr>
+      </w:pPr>
+      <w:r>
+        <w:rPr>
+          <w:rFonts w:ascii="Times New Roman" w:eastAsia="Times New Roman" w:hAnsi="Times New Roman" w:cs="Times New Roman"/>
+          <w:sz w:val="24"/>
+          <w:szCs w:val="24"/>
+          <w:lang w:eastAsia="ru-RU"/>
+        </w:rPr>
+        <w:t>3.3.</w:t>
+      </w:r>
+      <w:r>
+        <w:rPr>
+          <w:rFonts w:ascii="Times New Roman" w:eastAsia="Times New Roman" w:hAnsi="Times New Roman" w:cs="Times New Roman"/>
+          <w:sz w:val="24"/>
+          <w:szCs w:val="24"/>
+          <w:lang w:eastAsia="ru-RU"/>
+        </w:rPr>
+        <w:t>3</w:t>
+      </w:r>
+      <w:r>
+        <w:rPr>
+          <w:rFonts w:ascii="Times New Roman" w:eastAsia="Times New Roman" w:hAnsi="Times New Roman" w:cs="Times New Roman"/>
+          <w:sz w:val="24"/>
+          <w:szCs w:val="24"/>
+          <w:lang w:eastAsia="ru-RU"/>
+        </w:rPr>
+        <w:t xml:space="preserve">. Уровни напряжения на шинах ПС </w:t>
+      </w:r>
+      <w:r>
+        <w:rPr>
+          <w:rFonts w:ascii="Times New Roman" w:eastAsia="Times New Roman" w:hAnsi="Times New Roman" w:cs="Times New Roman"/>
+          <w:sz w:val="24"/>
+          <w:szCs w:val="24"/>
+          <w:lang w:eastAsia="ru-RU"/>
+        </w:rPr>
+        <w:t>В</w:t>
+      </w:r>
+      <w:r>
+        <w:rPr>
+          <w:rFonts w:ascii="Times New Roman" w:eastAsia="Times New Roman" w:hAnsi="Times New Roman" w:cs="Times New Roman"/>
+          <w:sz w:val="24"/>
+          <w:szCs w:val="24"/>
+          <w:lang w:eastAsia="ru-RU"/>
+        </w:rPr>
+        <w:t>:</w:t>
+      </w:r>
+    </w:p>
+    <w:tbl>
+      <w:tblPr>
+        <w:tblStyle w:val="af0"/>
+        <w:tblW w:w="10113" w:type="dxa"/>
+        <w:tblBorders>
+          <w:top w:val="none" w:sz="0" w:space="0" w:color="auto"/>
+          <w:left w:val="none" w:sz="0" w:space="0" w:color="auto"/>
+          <w:bottom w:val="none" w:sz="0" w:space="0" w:color="auto"/>
+          <w:right w:val="none" w:sz="0" w:space="0" w:color="auto"/>
+          <w:insideH w:val="none" w:sz="0" w:space="0" w:color="auto"/>
+          <w:insideV w:val="none" w:sz="0" w:space="0" w:color="auto"/>
+        </w:tblBorders>
+        <w:tblLook w:val="04A0" w:firstRow="1" w:lastRow="0" w:firstColumn="1" w:lastColumn="0" w:noHBand="0" w:noVBand="1"/>
+      </w:tblPr>
+      <w:tblGrid>
+        <w:gridCol w:w="3920"/>
+        <w:gridCol w:w="761"/>
+        <w:gridCol w:w="723"/>
+        <w:gridCol w:w="721"/>
+        <w:gridCol w:w="636"/>
+        <w:gridCol w:w="619"/>
+        <w:gridCol w:w="470"/>
+        <w:gridCol w:w="409"/>
+        <w:gridCol w:w="280"/>
+        <w:gridCol w:w="1574"/>
+      </w:tblGrid>
+      <w:tr>
+        <w:trPr>
+          <w:trHeight w:val="342"/>
+        </w:trPr>
+        <w:tc>
+          <w:tcPr>
+            <w:tcW w:w="3920" w:type="dxa"/>
+            <w:noWrap/>
+            <w:hideMark/>
+          </w:tcPr>
+          <w:p>
+            <w:pPr>
+              <w:spacing w:after="0" w:line="240" w:lineRule="auto"/>
+              <w:rPr>
+                <w:rFonts w:ascii="Times New Roman" w:eastAsia="Times New Roman" w:hAnsi="Times New Roman" w:cs="Times New Roman"/>
+                <w:sz w:val="24"/>
+                <w:szCs w:val="24"/>
+                <w:lang w:eastAsia="ru-RU"/>
+              </w:rPr>
+            </w:pPr>
+            <w:r>
+              <w:rPr>
+                <w:rFonts w:ascii="Times New Roman" w:eastAsia="Times New Roman" w:hAnsi="Times New Roman" w:cs="Times New Roman"/>
+                <w:sz w:val="24"/>
+                <w:szCs w:val="24"/>
+                <w:lang w:eastAsia="ru-RU"/>
+              </w:rPr>
+              <w:t xml:space="preserve">- в режиме максимальных нагрузок </w:t>
+            </w:r>
+          </w:p>
+        </w:tc>
+        <w:tc>
+          <w:tcPr>
+            <w:tcW w:w="761" w:type="dxa"/>
+            <w:noWrap/>
+            <w:hideMark/>
+          </w:tcPr>
+          <w:p>
+            <w:pPr>
+              <w:spacing w:after="0" w:line="240" w:lineRule="auto"/>
+              <w:jc w:val="center"/>
+              <w:rPr>
+                <w:rFonts w:ascii="Times New Roman" w:eastAsia="Times New Roman" w:hAnsi="Times New Roman" w:cs="Times New Roman"/>
+                <w:sz w:val="24"/>
+                <w:szCs w:val="24"/>
+                <w:u w:val="single"/>
+                <w:lang w:eastAsia="ru-RU"/>
+              </w:rPr>
+            </w:pPr>
+            <w:r>
+              <w:rPr>
+                <w:rFonts w:ascii="Times New Roman" w:eastAsia="Times New Roman" w:hAnsi="Times New Roman" w:cs="Times New Roman"/>
+                <w:sz w:val="24"/>
+                <w:szCs w:val="24"/>
+                <w:u w:val="single"/>
+                <w:lang w:eastAsia="ru-RU"/>
+              </w:rPr>
+              <w:t>1,05</w:t>
+            </w:r>
+          </w:p>
+        </w:tc>
+        <w:tc>
+          <w:tcPr>
+            <w:tcW w:w="723" w:type="dxa"/>
+            <w:hideMark/>
+          </w:tcPr>
+          <w:p>
+            <w:pPr>
+              <w:spacing w:after="0" w:line="240" w:lineRule="auto"/>
+              <w:jc w:val="center"/>
+              <w:rPr>
+                <w:rFonts w:ascii="Times New Roman" w:eastAsia="Times New Roman" w:hAnsi="Times New Roman" w:cs="Times New Roman"/>
+                <w:sz w:val="24"/>
+                <w:szCs w:val="24"/>
+                <w:lang w:eastAsia="ru-RU"/>
+              </w:rPr>
+            </w:pPr>
+            <w:proofErr w:type="spellStart"/>
+            <w:r>
+              <w:rPr>
+                <w:rFonts w:ascii="Times New Roman" w:eastAsia="Times New Roman" w:hAnsi="Times New Roman" w:cs="Times New Roman"/>
+                <w:sz w:val="24"/>
+                <w:szCs w:val="24"/>
+                <w:lang w:eastAsia="ru-RU"/>
+              </w:rPr>
+              <w:t>U</w:t>
+            </w:r>
+            <w:r>
+              <w:rPr>
+                <w:rFonts w:ascii="Times New Roman" w:eastAsia="Times New Roman" w:hAnsi="Times New Roman" w:cs="Times New Roman"/>
+                <w:sz w:val="24"/>
+                <w:szCs w:val="24"/>
+                <w:vertAlign w:val="subscript"/>
+                <w:lang w:eastAsia="ru-RU"/>
+              </w:rPr>
+              <w:t>ном</w:t>
+            </w:r>
+            <w:proofErr w:type="spellEnd"/>
+            <w:r>
+              <w:rPr>
+                <w:rFonts w:ascii="Times New Roman" w:eastAsia="Times New Roman" w:hAnsi="Times New Roman" w:cs="Times New Roman"/>
+                <w:sz w:val="24"/>
+                <w:szCs w:val="24"/>
+                <w:lang w:eastAsia="ru-RU"/>
+              </w:rPr>
+              <w:t>;</w:t>
+            </w:r>
+          </w:p>
+        </w:tc>
+        <w:tc>
+          <w:tcPr>
+            <w:tcW w:w="721" w:type="dxa"/>
+            <w:hideMark/>
+          </w:tcPr>
+          <w:p>
+            <w:pPr>
+              <w:spacing w:after="0" w:line="240" w:lineRule="auto"/>
+              <w:rPr>
+                <w:rFonts w:ascii="Times New Roman" w:eastAsia="Times New Roman" w:hAnsi="Times New Roman" w:cs="Times New Roman"/>
+                <w:b/>
+                <w:bCs/>
+                <w:sz w:val="24"/>
+                <w:szCs w:val="24"/>
+                <w:lang w:eastAsia="ru-RU"/>
+              </w:rPr>
+            </w:pPr>
+          </w:p>
+        </w:tc>
+        <w:tc>
+          <w:tcPr>
+            <w:tcW w:w="636" w:type="dxa"/>
+            <w:hideMark/>
+          </w:tcPr>
+          <w:p>
+            <w:pPr>
+              <w:spacing w:after="0" w:line="240" w:lineRule="auto"/>
+              <w:rPr>
+                <w:rFonts w:ascii="Times New Roman" w:eastAsia="Times New Roman" w:hAnsi="Times New Roman" w:cs="Times New Roman"/>
+                <w:b/>
+                <w:bCs/>
+                <w:sz w:val="24"/>
+                <w:szCs w:val="24"/>
+                <w:lang w:eastAsia="ru-RU"/>
+              </w:rPr>
+            </w:pPr>
+          </w:p>
+        </w:tc>
+        <w:tc>
+          <w:tcPr>
+            <w:tcW w:w="619" w:type="dxa"/>
+            <w:hideMark/>
+          </w:tcPr>
+          <w:p>
+            <w:pPr>
+              <w:spacing w:after="0" w:line="240" w:lineRule="auto"/>
+              <w:rPr>
+                <w:rFonts w:ascii="Times New Roman" w:eastAsia="Times New Roman" w:hAnsi="Times New Roman" w:cs="Times New Roman"/>
+                <w:b/>
+                <w:bCs/>
+                <w:sz w:val="24"/>
+                <w:szCs w:val="24"/>
+                <w:lang w:eastAsia="ru-RU"/>
+              </w:rPr>
+            </w:pPr>
+          </w:p>
+        </w:tc>
+        <w:tc>
+          <w:tcPr>
+            <w:tcW w:w="470" w:type="dxa"/>
+            <w:hideMark/>
+          </w:tcPr>
+          <w:p>
+            <w:pPr>
+              <w:spacing w:after="0" w:line="240" w:lineRule="auto"/>
+              <w:rPr>
+                <w:rFonts w:ascii="Times New Roman" w:eastAsia="Times New Roman" w:hAnsi="Times New Roman" w:cs="Times New Roman"/>
+                <w:b/>
+                <w:bCs/>
+                <w:sz w:val="24"/>
+                <w:szCs w:val="24"/>
+                <w:lang w:eastAsia="ru-RU"/>
+              </w:rPr>
+            </w:pPr>
+          </w:p>
+        </w:tc>
+        <w:tc>
+          <w:tcPr>
+            <w:tcW w:w="409" w:type="dxa"/>
+            <w:hideMark/>
+          </w:tcPr>
+          <w:p>
+            <w:pPr>
+              <w:spacing w:after="0" w:line="240" w:lineRule="auto"/>
+              <w:rPr>
+                <w:rFonts w:ascii="Times New Roman" w:eastAsia="Times New Roman" w:hAnsi="Times New Roman" w:cs="Times New Roman"/>
+                <w:b/>
+                <w:bCs/>
+                <w:sz w:val="24"/>
+                <w:szCs w:val="24"/>
+                <w:lang w:eastAsia="ru-RU"/>
+              </w:rPr>
+            </w:pPr>
+          </w:p>
+        </w:tc>
+        <w:tc>
+          <w:tcPr>
+            <w:tcW w:w="280" w:type="dxa"/>
+            <w:hideMark/>
+          </w:tcPr>
+          <w:p>
+            <w:pPr>
+              <w:spacing w:after="0" w:line="240" w:lineRule="auto"/>
+              <w:rPr>
+                <w:rFonts w:ascii="Times New Roman" w:eastAsia="Times New Roman" w:hAnsi="Times New Roman" w:cs="Times New Roman"/>
+                <w:b/>
+                <w:bCs/>
+                <w:sz w:val="24"/>
+                <w:szCs w:val="24"/>
+                <w:lang w:eastAsia="ru-RU"/>
+              </w:rPr>
+            </w:pPr>
+          </w:p>
+        </w:tc>
+        <w:tc>
+          <w:tcPr>
+            <w:tcW w:w="1574" w:type="dxa"/>
+            <w:noWrap/>
+            <w:hideMark/>
+          </w:tcPr>
+          <w:p>
+            <w:pPr>
+              <w:spacing w:after="0" w:line="240" w:lineRule="auto"/>
+              <w:rPr>
+                <w:rFonts w:ascii="Arial CYR" w:eastAsia="Times New Roman" w:hAnsi="Arial CYR" w:cs="Arial CYR"/>
+                <w:sz w:val="20"/>
+                <w:szCs w:val="20"/>
+                <w:lang w:eastAsia="ru-RU"/>
+              </w:rPr>
+            </w:pPr>
+          </w:p>
+        </w:tc>
+      </w:tr>
+      <w:tr>
+        <w:trPr>
+          <w:trHeight w:val="342"/>
+        </w:trPr>
+        <w:tc>
+          <w:tcPr>
+            <w:tcW w:w="3920" w:type="dxa"/>
+            <w:noWrap/>
+            <w:hideMark/>
+          </w:tcPr>
+          <w:p>
+            <w:pPr>
+              <w:spacing w:after="0" w:line="240" w:lineRule="auto"/>
+              <w:rPr>
+                <w:rFonts w:ascii="Times New Roman" w:eastAsia="Times New Roman" w:hAnsi="Times New Roman" w:cs="Times New Roman"/>
+                <w:sz w:val="24"/>
+                <w:szCs w:val="24"/>
+                <w:lang w:eastAsia="ru-RU"/>
+              </w:rPr>
+            </w:pPr>
+            <w:r>
+              <w:rPr>
+                <w:rFonts w:ascii="Times New Roman" w:eastAsia="Times New Roman" w:hAnsi="Times New Roman" w:cs="Times New Roman"/>
+                <w:sz w:val="24"/>
+                <w:szCs w:val="24"/>
+                <w:lang w:eastAsia="ru-RU"/>
+              </w:rPr>
+              <w:t>- в режиме минимальных нагрузок</w:t>
+            </w:r>
+          </w:p>
+        </w:tc>
+        <w:tc>
+          <w:tcPr>
+            <w:tcW w:w="761" w:type="dxa"/>
+            <w:noWrap/>
+            <w:hideMark/>
+          </w:tcPr>
+          <w:p>
+            <w:pPr>
+              <w:spacing w:after="0" w:line="240" w:lineRule="auto"/>
+              <w:jc w:val="center"/>
+              <w:rPr>
+                <w:rFonts w:ascii="Times New Roman" w:eastAsia="Times New Roman" w:hAnsi="Times New Roman" w:cs="Times New Roman"/>
+                <w:sz w:val="24"/>
+                <w:szCs w:val="24"/>
+                <w:u w:val="single"/>
+                <w:lang w:eastAsia="ru-RU"/>
+              </w:rPr>
+            </w:pPr>
+            <w:r>
+              <w:rPr>
+                <w:rFonts w:ascii="Times New Roman" w:eastAsia="Times New Roman" w:hAnsi="Times New Roman" w:cs="Times New Roman"/>
+                <w:sz w:val="24"/>
+                <w:szCs w:val="24"/>
+                <w:u w:val="single"/>
+                <w:lang w:eastAsia="ru-RU"/>
+              </w:rPr>
+              <w:t>1,00</w:t>
+            </w:r>
+          </w:p>
+        </w:tc>
+        <w:tc>
+          <w:tcPr>
+            <w:tcW w:w="723" w:type="dxa"/>
+            <w:hideMark/>
+          </w:tcPr>
+          <w:p>
+            <w:pPr>
+              <w:spacing w:after="0" w:line="240" w:lineRule="auto"/>
+              <w:jc w:val="center"/>
+              <w:rPr>
+                <w:rFonts w:ascii="Times New Roman" w:eastAsia="Times New Roman" w:hAnsi="Times New Roman" w:cs="Times New Roman"/>
+                <w:sz w:val="24"/>
+                <w:szCs w:val="24"/>
+                <w:lang w:eastAsia="ru-RU"/>
+              </w:rPr>
+            </w:pPr>
+            <w:proofErr w:type="spellStart"/>
+            <w:r>
+              <w:rPr>
+                <w:rFonts w:ascii="Times New Roman" w:eastAsia="Times New Roman" w:hAnsi="Times New Roman" w:cs="Times New Roman"/>
+                <w:sz w:val="24"/>
+                <w:szCs w:val="24"/>
+                <w:lang w:eastAsia="ru-RU"/>
+              </w:rPr>
+              <w:t>U</w:t>
+            </w:r>
+            <w:r>
+              <w:rPr>
+                <w:rFonts w:ascii="Times New Roman" w:eastAsia="Times New Roman" w:hAnsi="Times New Roman" w:cs="Times New Roman"/>
+                <w:sz w:val="24"/>
+                <w:szCs w:val="24"/>
+                <w:vertAlign w:val="subscript"/>
+                <w:lang w:eastAsia="ru-RU"/>
+              </w:rPr>
+              <w:t>ном</w:t>
+            </w:r>
+            <w:proofErr w:type="spellEnd"/>
+            <w:r>
+              <w:rPr>
+                <w:rFonts w:ascii="Times New Roman" w:eastAsia="Times New Roman" w:hAnsi="Times New Roman" w:cs="Times New Roman"/>
+                <w:sz w:val="24"/>
+                <w:szCs w:val="24"/>
+                <w:lang w:eastAsia="ru-RU"/>
+              </w:rPr>
+              <w:t>.</w:t>
+            </w:r>
+          </w:p>
+        </w:tc>
+        <w:tc>
+          <w:tcPr>
+            <w:tcW w:w="721" w:type="dxa"/>
+            <w:hideMark/>
+          </w:tcPr>
+          <w:p>
+            <w:pPr>
+              <w:spacing w:after="0" w:line="240" w:lineRule="auto"/>
+              <w:rPr>
+                <w:rFonts w:ascii="Times New Roman" w:eastAsia="Times New Roman" w:hAnsi="Times New Roman" w:cs="Times New Roman"/>
+                <w:b/>
+                <w:bCs/>
+                <w:sz w:val="24"/>
+                <w:szCs w:val="24"/>
+                <w:lang w:eastAsia="ru-RU"/>
+              </w:rPr>
+            </w:pPr>
+          </w:p>
+        </w:tc>
+        <w:tc>
+          <w:tcPr>
+            <w:tcW w:w="636" w:type="dxa"/>
+            <w:hideMark/>
+          </w:tcPr>
+          <w:p>
+            <w:pPr>
+              <w:spacing w:after="0" w:line="240" w:lineRule="auto"/>
+              <w:rPr>
+                <w:rFonts w:ascii="Times New Roman" w:eastAsia="Times New Roman" w:hAnsi="Times New Roman" w:cs="Times New Roman"/>
+                <w:b/>
+                <w:bCs/>
+                <w:sz w:val="24"/>
+                <w:szCs w:val="24"/>
+                <w:lang w:eastAsia="ru-RU"/>
+              </w:rPr>
+            </w:pPr>
+          </w:p>
+        </w:tc>
+        <w:tc>
+          <w:tcPr>
+            <w:tcW w:w="619" w:type="dxa"/>
+            <w:hideMark/>
+          </w:tcPr>
+          <w:p>
+            <w:pPr>
+              <w:spacing w:after="0" w:line="240" w:lineRule="auto"/>
+              <w:rPr>
+                <w:rFonts w:ascii="Times New Roman" w:eastAsia="Times New Roman" w:hAnsi="Times New Roman" w:cs="Times New Roman"/>
+                <w:b/>
+                <w:bCs/>
+                <w:sz w:val="24"/>
+                <w:szCs w:val="24"/>
+                <w:lang w:eastAsia="ru-RU"/>
+              </w:rPr>
+            </w:pPr>
+          </w:p>
+        </w:tc>
+        <w:tc>
+          <w:tcPr>
+            <w:tcW w:w="470" w:type="dxa"/>
+            <w:hideMark/>
+          </w:tcPr>
+          <w:p>
+            <w:pPr>
+              <w:spacing w:after="0" w:line="240" w:lineRule="auto"/>
+              <w:rPr>
+                <w:rFonts w:ascii="Times New Roman" w:eastAsia="Times New Roman" w:hAnsi="Times New Roman" w:cs="Times New Roman"/>
+                <w:b/>
+                <w:bCs/>
+                <w:sz w:val="24"/>
+                <w:szCs w:val="24"/>
+                <w:lang w:eastAsia="ru-RU"/>
+              </w:rPr>
+            </w:pPr>
+          </w:p>
+        </w:tc>
+        <w:tc>
+          <w:tcPr>
+            <w:tcW w:w="409" w:type="dxa"/>
+            <w:hideMark/>
+          </w:tcPr>
+          <w:p>
+            <w:pPr>
+              <w:spacing w:after="0" w:line="240" w:lineRule="auto"/>
+              <w:rPr>
+                <w:rFonts w:ascii="Times New Roman" w:eastAsia="Times New Roman" w:hAnsi="Times New Roman" w:cs="Times New Roman"/>
+                <w:b/>
+                <w:bCs/>
+                <w:sz w:val="24"/>
+                <w:szCs w:val="24"/>
+                <w:lang w:eastAsia="ru-RU"/>
+              </w:rPr>
+            </w:pPr>
+          </w:p>
+        </w:tc>
+        <w:tc>
+          <w:tcPr>
+            <w:tcW w:w="280" w:type="dxa"/>
+            <w:hideMark/>
+          </w:tcPr>
+          <w:p>
+            <w:pPr>
+              <w:spacing w:after="0" w:line="240" w:lineRule="auto"/>
+              <w:rPr>
+                <w:rFonts w:ascii="Times New Roman" w:eastAsia="Times New Roman" w:hAnsi="Times New Roman" w:cs="Times New Roman"/>
+                <w:b/>
+                <w:bCs/>
+                <w:sz w:val="24"/>
+                <w:szCs w:val="24"/>
+                <w:lang w:eastAsia="ru-RU"/>
+              </w:rPr>
+            </w:pPr>
+          </w:p>
+        </w:tc>
+        <w:tc>
+          <w:tcPr>
+            <w:tcW w:w="1574" w:type="dxa"/>
+            <w:noWrap/>
+            <w:hideMark/>
+          </w:tcPr>
+          <w:p>
+            <w:pPr>
+              <w:spacing w:after="0" w:line="240" w:lineRule="auto"/>
+              <w:rPr>
+                <w:rFonts w:ascii="Arial CYR" w:eastAsia="Times New Roman" w:hAnsi="Arial CYR" w:cs="Arial CYR"/>
+                <w:sz w:val="20"/>
+                <w:szCs w:val="20"/>
+                <w:lang w:eastAsia="ru-RU"/>
+              </w:rPr>
+            </w:pPr>
+          </w:p>
+        </w:tc>
+      </w:tr>
+    </w:tbl>
+    <w:p>
+      <w:pPr>
+        <w:spacing w:after="0" w:line="240" w:lineRule="auto"/>
+        <w:rPr>
           <w:rFonts w:ascii="Times New Roman" w:hAnsi="Times New Roman" w:cs="Times New Roman"/>
           <w:snapToGrid w:val="0"/>
           <w:sz w:val="24"/>
@@ -7689,7 +8313,7 @@
                 <w:lang w:eastAsia="ru-RU"/>
               </w:rPr>
             </w:pPr>
-            <w:bookmarkStart w:id="46" w:name="RANGE!A17"/>
+            <w:bookmarkStart w:id="41" w:name="RANGE!A17"/>
             <w:r>
               <w:rPr>
                 <w:rFonts w:ascii="Times New Roman" w:eastAsia="Times New Roman" w:hAnsi="Times New Roman" w:cs="Times New Roman"/>
@@ -7699,7 +8323,7 @@
               </w:rPr>
               <w:t>3.4.1. Коэффициент участия нагрузок района в максимуме энергосистемы Км =</w:t>
             </w:r>
-            <w:bookmarkEnd w:id="46"/>
+            <w:bookmarkEnd w:id="41"/>
           </w:p>
         </w:tc>
         <w:tc>
@@ -7765,7 +8389,7 @@
                 <w:lang w:eastAsia="ru-RU"/>
               </w:rPr>
             </w:pPr>
-            <w:bookmarkStart w:id="47" w:name="RANGE!A18"/>
+            <w:bookmarkStart w:id="42" w:name="RANGE!A18"/>
             <w:r>
               <w:rPr>
                 <w:rFonts w:ascii="Times New Roman" w:eastAsia="Times New Roman" w:hAnsi="Times New Roman" w:cs="Times New Roman"/>
@@ -7775,7 +8399,7 @@
               </w:rPr>
               <w:t>3.4.2. Продолжительность максимума зимнего суточного графика h =</w:t>
             </w:r>
-            <w:bookmarkEnd w:id="47"/>
+            <w:bookmarkEnd w:id="42"/>
           </w:p>
         </w:tc>
         <w:tc>
@@ -8898,8 +9522,8 @@
       </w:tblPr>
       <w:tblGrid>
         <w:gridCol w:w="4681"/>
-        <w:gridCol w:w="2699"/>
-        <w:gridCol w:w="470"/>
+        <w:gridCol w:w="2123"/>
+        <w:gridCol w:w="1046"/>
         <w:gridCol w:w="409"/>
         <w:gridCol w:w="280"/>
         <w:gridCol w:w="1574"/>
@@ -8930,7 +9554,7 @@
                 <w:lang w:eastAsia="ru-RU"/>
               </w:rPr>
             </w:pPr>
-            <w:bookmarkStart w:id="48" w:name="RANGE!A23"/>
+            <w:bookmarkStart w:id="43" w:name="RANGE!A23"/>
             <w:r>
               <w:rPr>
                 <w:rFonts w:ascii="Times New Roman" w:eastAsia="Times New Roman" w:hAnsi="Times New Roman" w:cs="Times New Roman"/>
@@ -8940,7 +9564,7 @@
               </w:rPr>
               <w:t>- район нагрузок принадлежит ОЭС</w:t>
             </w:r>
-            <w:bookmarkEnd w:id="48"/>
+            <w:bookmarkEnd w:id="43"/>
           </w:p>
         </w:tc>
         <w:tc>
@@ -9059,7 +9683,7 @@
         </w:trPr>
         <w:tc>
           <w:tcPr>
-            <w:tcW w:w="7380" w:type="dxa"/>
+            <w:tcW w:w="6804" w:type="dxa"/>
             <w:gridSpan w:val="2"/>
             <w:tcBorders>
               <w:top w:val="nil"/>
@@ -9080,7 +9704,7 @@
                 <w:lang w:eastAsia="ru-RU"/>
               </w:rPr>
             </w:pPr>
-            <w:bookmarkStart w:id="49" w:name="RANGE!A24"/>
+            <w:bookmarkStart w:id="44" w:name="RANGE!A24"/>
             <w:r>
               <w:rPr>
                 <w:rFonts w:ascii="Times New Roman" w:eastAsia="Times New Roman" w:hAnsi="Times New Roman" w:cs="Times New Roman"/>
@@ -9147,12 +9771,12 @@
               </w:rPr>
               <w:t xml:space="preserve"> </w:t>
             </w:r>
-            <w:bookmarkEnd w:id="49"/>
-          </w:p>
-        </w:tc>
-        <w:tc>
-          <w:tcPr>
-            <w:tcW w:w="470" w:type="dxa"/>
+            <w:bookmarkEnd w:id="44"/>
+          </w:p>
+        </w:tc>
+        <w:tc>
+          <w:tcPr>
+            <w:tcW w:w="1046" w:type="dxa"/>
             <w:tcBorders>
               <w:top w:val="nil"/>
               <w:left w:val="nil"/>
@@ -10868,6 +11492,74 @@
       </w:tblBorders>
     </w:tblPr>
   </w:style>
+  <w:style w:type="character" w:styleId="af1">
+    <w:name w:val="annotation reference"/>
+    <w:basedOn w:val="a1"/>
+    <w:uiPriority w:val="99"/>
+    <w:semiHidden/>
+    <w:unhideWhenUsed/>
+    <w:rsid w:val="00091043"/>
+    <w:rPr>
+      <w:sz w:val="16"/>
+      <w:szCs w:val="16"/>
+    </w:rPr>
+  </w:style>
+  <w:style w:type="paragraph" w:styleId="af2">
+    <w:name w:val="annotation text"/>
+    <w:basedOn w:val="a"/>
+    <w:link w:val="af3"/>
+    <w:uiPriority w:val="99"/>
+    <w:semiHidden/>
+    <w:unhideWhenUsed/>
+    <w:rsid w:val="00091043"/>
+    <w:pPr>
+      <w:spacing w:line="240" w:lineRule="auto"/>
+    </w:pPr>
+    <w:rPr>
+      <w:sz w:val="20"/>
+      <w:szCs w:val="20"/>
+    </w:rPr>
+  </w:style>
+  <w:style w:type="character" w:customStyle="1" w:styleId="af3">
+    <w:name w:val="Текст примечания Знак"/>
+    <w:basedOn w:val="a1"/>
+    <w:link w:val="af2"/>
+    <w:uiPriority w:val="99"/>
+    <w:semiHidden/>
+    <w:rsid w:val="00091043"/>
+    <w:rPr>
+      <w:sz w:val="20"/>
+      <w:szCs w:val="20"/>
+    </w:rPr>
+  </w:style>
+  <w:style w:type="paragraph" w:styleId="af4">
+    <w:name w:val="annotation subject"/>
+    <w:basedOn w:val="af2"/>
+    <w:next w:val="af2"/>
+    <w:link w:val="af5"/>
+    <w:uiPriority w:val="99"/>
+    <w:semiHidden/>
+    <w:unhideWhenUsed/>
+    <w:rsid w:val="00091043"/>
+    <w:rPr>
+      <w:b/>
+      <w:bCs/>
+    </w:rPr>
+  </w:style>
+  <w:style w:type="character" w:customStyle="1" w:styleId="af5">
+    <w:name w:val="Тема примечания Знак"/>
+    <w:basedOn w:val="af3"/>
+    <w:link w:val="af4"/>
+    <w:uiPriority w:val="99"/>
+    <w:semiHidden/>
+    <w:rsid w:val="00091043"/>
+    <w:rPr>
+      <w:b/>
+      <w:bCs/>
+      <w:sz w:val="20"/>
+      <w:szCs w:val="20"/>
+    </w:rPr>
+  </w:style>
 </w:styles>
 </file>
 

</xml_diff>